<commit_message>
Corrige login movil, agrega .gitignore raiz y evidencia GA8
- Fix: PetConnect.Mobile no soportaba el login en dos pasos que ya
  tenia la web (AuthContext.js, LoginScreen.js, api.js). Se agrego
  establecerSesion() para el registro y iniciarLogin/verificarLogin
  para el login, probado en vivo.
- Nuevo .gitignore en la raiz como respaldo de los que ya existian
  por modulo (.venv, .venv-1, .env, node_modules, __pycache__, etc).
- Nuevo documento GA8-220501096-AA1-EV02-PetConnect.docx (evidencia
  de modulos integrados): tabla de modulos con entrada/salida,
  evidencia real de integracion (rechazo por llave foranea), y acta
  de pruebas con 9 casos reales.
- Documentos movidos a Documentacion/ y actualizados con el arreglo
  del login movil y la referencia cruzada entre evidencias GA7/GA8.
</commit_message>
<xml_diff>
--- a/petconnect.Backend/DOCUMENTACION_PETCONNECT.docx
+++ b/petconnect.Backend/DOCUMENTACION_PETCONNECT.docx
@@ -14247,6 +14247,1464 @@
         <w:t xml:space="preserve">Los tres módulos comparten la misma base de datos MySQL (petconnect) y las mismas reglas de negocio, evidenciando los principios de reutilización, independencia, escalabilidad y mantenibilidad que debe tener un software correctamente modularizado. La colección de pruebas Postman (petconnect.Backend/postman/PetConnect.postman_collection.json) permite validar la API que integra los módulos web y móvil de forma independiente del código fuente.</w:t>
       </w:r>
     </w:p>
+    <w:p>
+      <w:r>
+        <w:br w:type="page"/>
+      </w:r>
+    </w:p>
+    <w:p>
+      <w:pPr>
+        <w:pStyle w:val="Heading1"/>
+      </w:pPr>
+      <w:r>
+        <w:t xml:space="preserve">15. Actualización: autenticación con doble verificación por correo</w:t>
+      </w:r>
+    </w:p>
+    <w:p>
+      <w:pPr>
+        <w:spacing w:after="160"/>
+      </w:pPr>
+      <w:r>
+        <w:t xml:space="preserve">Tras la primera versión de esta documentación, el módulo de autenticación de la API (petconnect.Backend/api.py) se amplió para exigir un código de un solo uso enviado al correo electrónico tanto en el registro como en el inicio de sesión, y para enviar esos correos de verdad mediante SMTP de Gmail.</w:t>
+      </w:r>
+    </w:p>
+    <w:p>
+      <w:pPr>
+        <w:pStyle w:val="Heading2"/>
+      </w:pPr>
+      <w:r>
+        <w:t xml:space="preserve">15.1 Nuevos módulos: correo/ y otp/</w:t>
+      </w:r>
+    </w:p>
+    <w:p>
+      <w:pPr>
+        <w:spacing w:after="160"/>
+      </w:pPr>
+      <w:r>
+        <w:t xml:space="preserve">La lógica de envío de correo y de manejo de códigos de un solo uso (OTP) se extrajo de api.py a dos paquetes de Python independientes, siguiendo el mismo patrón de organización por capas usado en el resto del proyecto (conexion/, dao/, security/):</w:t>
+      </w:r>
+    </w:p>
+    <w:p>
+      <w:pPr>
+        <w:spacing w:after="20" w:before="20"/>
+        <w:ind w:left="360"/>
+      </w:pPr>
+      <w:r>
+        <w:rPr>
+          <w:rFonts w:ascii="Consolas" w:cs="Consolas" w:eastAsia="Consolas" w:hAnsi="Consolas"/>
+          <w:color w:val="2E2E2E"/>
+          <w:sz w:val="18"/>
+          <w:szCs w:val="18"/>
+        </w:rPr>
+        <w:t xml:space="preserve">petconnect.Backend/</w:t>
+      </w:r>
+    </w:p>
+    <w:p>
+      <w:pPr>
+        <w:spacing w:after="20" w:before="20"/>
+        <w:ind w:left="360"/>
+      </w:pPr>
+      <w:r>
+        <w:rPr>
+          <w:rFonts w:ascii="Consolas" w:cs="Consolas" w:eastAsia="Consolas" w:hAnsi="Consolas"/>
+          <w:color w:val="2E2E2E"/>
+          <w:sz w:val="18"/>
+          <w:szCs w:val="18"/>
+        </w:rPr>
+        <w:t xml:space="preserve">  correo/</w:t>
+      </w:r>
+    </w:p>
+    <w:p>
+      <w:pPr>
+        <w:spacing w:after="20" w:before="20"/>
+        <w:ind w:left="360"/>
+      </w:pPr>
+      <w:r>
+        <w:rPr>
+          <w:rFonts w:ascii="Consolas" w:cs="Consolas" w:eastAsia="Consolas" w:hAnsi="Consolas"/>
+          <w:color w:val="2E2E2E"/>
+          <w:sz w:val="18"/>
+          <w:szCs w:val="18"/>
+        </w:rPr>
+        <w:t xml:space="preserve">    __init__.py     Expone enviar_codigo, enviar_bienvenida, enviar_correo</w:t>
+      </w:r>
+    </w:p>
+    <w:p>
+      <w:pPr>
+        <w:spacing w:after="20" w:before="20"/>
+        <w:ind w:left="360"/>
+      </w:pPr>
+      <w:r>
+        <w:rPr>
+          <w:rFonts w:ascii="Consolas" w:cs="Consolas" w:eastAsia="Consolas" w:hAnsi="Consolas"/>
+          <w:color w:val="2E2E2E"/>
+          <w:sz w:val="18"/>
+          <w:szCs w:val="18"/>
+        </w:rPr>
+        <w:t xml:space="preserve">    plantillas.py    Plantillas HTML (codigo de verificacion y bienvenida)</w:t>
+      </w:r>
+    </w:p>
+    <w:p>
+      <w:pPr>
+        <w:spacing w:after="20" w:before="20"/>
+        <w:ind w:left="360"/>
+      </w:pPr>
+      <w:r>
+        <w:rPr>
+          <w:rFonts w:ascii="Consolas" w:cs="Consolas" w:eastAsia="Consolas" w:hAnsi="Consolas"/>
+          <w:color w:val="2E2E2E"/>
+          <w:sz w:val="18"/>
+          <w:szCs w:val="18"/>
+        </w:rPr>
+        <w:t xml:space="preserve">    servicio.py       Envio real: Gmail SMTP / SMTP generico / API de Mailtrap</w:t>
+      </w:r>
+    </w:p>
+    <w:p>
+      <w:pPr>
+        <w:spacing w:after="20" w:before="20"/>
+        <w:ind w:left="360"/>
+      </w:pPr>
+      <w:r>
+        <w:rPr>
+          <w:rFonts w:ascii="Consolas" w:cs="Consolas" w:eastAsia="Consolas" w:hAnsi="Consolas"/>
+          <w:color w:val="2E2E2E"/>
+          <w:sz w:val="18"/>
+          <w:szCs w:val="18"/>
+        </w:rPr>
+        <w:t xml:space="preserve">  otp/</w:t>
+      </w:r>
+    </w:p>
+    <w:p>
+      <w:pPr>
+        <w:spacing w:after="20" w:before="20"/>
+        <w:ind w:left="360"/>
+      </w:pPr>
+      <w:r>
+        <w:rPr>
+          <w:rFonts w:ascii="Consolas" w:cs="Consolas" w:eastAsia="Consolas" w:hAnsi="Consolas"/>
+          <w:color w:val="2E2E2E"/>
+          <w:sz w:val="18"/>
+          <w:szCs w:val="18"/>
+        </w:rPr>
+        <w:t xml:space="preserve">    __init__.py     Expone AlmacenOTP, generar_codigo</w:t>
+      </w:r>
+    </w:p>
+    <w:p>
+      <w:pPr>
+        <w:spacing w:after="20" w:before="20"/>
+        <w:ind w:left="360"/>
+      </w:pPr>
+      <w:r>
+        <w:rPr>
+          <w:rFonts w:ascii="Consolas" w:cs="Consolas" w:eastAsia="Consolas" w:hAnsi="Consolas"/>
+          <w:color w:val="2E2E2E"/>
+          <w:sz w:val="18"/>
+          <w:szCs w:val="18"/>
+        </w:rPr>
+        <w:t xml:space="preserve">    servicio.py       Clase AlmacenOTP: crear, verificar y descartar codigos</w:t>
+      </w:r>
+    </w:p>
+    <w:p>
+      <w:pPr>
+        <w:spacing w:after="120"/>
+      </w:pPr>
+    </w:p>
+    <w:p>
+      <w:pPr>
+        <w:spacing w:after="80"/>
+      </w:pPr>
+      <w:r>
+        <w:rPr>
+          <w:b/>
+          <w:bCs/>
+        </w:rPr>
+        <w:t xml:space="preserve">Clase AlmacenOTP (otp/servicio.py): </w:t>
+      </w:r>
+      <w:r>
+        <w:t xml:space="preserve">reutilizada tanto por el registro como por el login, evita repetir la logica de generar/expirar/validar codigos en cada endpoint.</w:t>
+      </w:r>
+    </w:p>
+    <w:p>
+      <w:pPr>
+        <w:spacing w:after="20" w:before="20"/>
+        <w:ind w:left="360"/>
+      </w:pPr>
+      <w:r>
+        <w:rPr>
+          <w:rFonts w:ascii="Consolas" w:cs="Consolas" w:eastAsia="Consolas" w:hAnsi="Consolas"/>
+          <w:color w:val="2E2E2E"/>
+          <w:sz w:val="18"/>
+          <w:szCs w:val="18"/>
+        </w:rPr>
+        <w:t xml:space="preserve">class AlmacenOTP:</w:t>
+      </w:r>
+    </w:p>
+    <w:p>
+      <w:pPr>
+        <w:spacing w:after="20" w:before="20"/>
+        <w:ind w:left="360"/>
+      </w:pPr>
+      <w:r>
+        <w:rPr>
+          <w:rFonts w:ascii="Consolas" w:cs="Consolas" w:eastAsia="Consolas" w:hAnsi="Consolas"/>
+          <w:color w:val="2E2E2E"/>
+          <w:sz w:val="18"/>
+          <w:szCs w:val="18"/>
+        </w:rPr>
+        <w:t xml:space="preserve">    def crear(self, clave, datos=None):</w:t>
+      </w:r>
+    </w:p>
+    <w:p>
+      <w:pPr>
+        <w:spacing w:after="20" w:before="20"/>
+        <w:ind w:left="360"/>
+      </w:pPr>
+      <w:r>
+        <w:rPr>
+          <w:rFonts w:ascii="Consolas" w:cs="Consolas" w:eastAsia="Consolas" w:hAnsi="Consolas"/>
+          <w:color w:val="2E2E2E"/>
+          <w:sz w:val="18"/>
+          <w:szCs w:val="18"/>
+        </w:rPr>
+        <w:t xml:space="preserve">        codigo = generar_codigo()  # secrets.randbelow, no random</w:t>
+      </w:r>
+    </w:p>
+    <w:p>
+      <w:pPr>
+        <w:spacing w:after="20" w:before="20"/>
+        <w:ind w:left="360"/>
+      </w:pPr>
+      <w:r>
+        <w:rPr>
+          <w:rFonts w:ascii="Consolas" w:cs="Consolas" w:eastAsia="Consolas" w:hAnsi="Consolas"/>
+          <w:color w:val="2E2E2E"/>
+          <w:sz w:val="18"/>
+          <w:szCs w:val="18"/>
+        </w:rPr>
+        <w:t xml:space="preserve">        self._pendientes[clave] = {**(datos or {}), "code": codigo,</w:t>
+      </w:r>
+    </w:p>
+    <w:p>
+      <w:pPr>
+        <w:spacing w:after="20" w:before="20"/>
+        <w:ind w:left="360"/>
+      </w:pPr>
+      <w:r>
+        <w:rPr>
+          <w:rFonts w:ascii="Consolas" w:cs="Consolas" w:eastAsia="Consolas" w:hAnsi="Consolas"/>
+          <w:color w:val="2E2E2E"/>
+          <w:sz w:val="18"/>
+          <w:szCs w:val="18"/>
+        </w:rPr>
+        <w:t xml:space="preserve">                                     "expires": time.time() + 600}</w:t>
+      </w:r>
+    </w:p>
+    <w:p>
+      <w:pPr>
+        <w:spacing w:after="20" w:before="20"/>
+        <w:ind w:left="360"/>
+      </w:pPr>
+      <w:r>
+        <w:rPr>
+          <w:rFonts w:ascii="Consolas" w:cs="Consolas" w:eastAsia="Consolas" w:hAnsi="Consolas"/>
+          <w:color w:val="2E2E2E"/>
+          <w:sz w:val="18"/>
+          <w:szCs w:val="18"/>
+        </w:rPr>
+        <w:t xml:space="preserve">        return codigo</w:t>
+      </w:r>
+    </w:p>
+    <w:p>
+      <w:pPr>
+        <w:spacing w:after="20" w:before="20"/>
+        <w:ind w:left="360"/>
+      </w:pPr>
+      <w:r>
+        <w:rPr>
+          <w:rFonts w:ascii="Consolas" w:cs="Consolas" w:eastAsia="Consolas" w:hAnsi="Consolas"/>
+          <w:color w:val="2E2E2E"/>
+          <w:sz w:val="18"/>
+          <w:szCs w:val="18"/>
+        </w:rPr>
+        <w:t xml:space="preserve"> </w:t>
+      </w:r>
+    </w:p>
+    <w:p>
+      <w:pPr>
+        <w:spacing w:after="20" w:before="20"/>
+        <w:ind w:left="360"/>
+      </w:pPr>
+      <w:r>
+        <w:rPr>
+          <w:rFonts w:ascii="Consolas" w:cs="Consolas" w:eastAsia="Consolas" w:hAnsi="Consolas"/>
+          <w:color w:val="2E2E2E"/>
+          <w:sz w:val="18"/>
+          <w:szCs w:val="18"/>
+        </w:rPr>
+        <w:t xml:space="preserve">    def verificar(self, clave, codigo):</w:t>
+      </w:r>
+    </w:p>
+    <w:p>
+      <w:pPr>
+        <w:spacing w:after="20" w:before="20"/>
+        <w:ind w:left="360"/>
+      </w:pPr>
+      <w:r>
+        <w:rPr>
+          <w:rFonts w:ascii="Consolas" w:cs="Consolas" w:eastAsia="Consolas" w:hAnsi="Consolas"/>
+          <w:color w:val="2E2E2E"/>
+          <w:sz w:val="18"/>
+          <w:szCs w:val="18"/>
+        </w:rPr>
+        <w:t xml:space="preserve">        # retorna (datos, None) si es valido,</w:t>
+      </w:r>
+    </w:p>
+    <w:p>
+      <w:pPr>
+        <w:spacing w:after="20" w:before="20"/>
+        <w:ind w:left="360"/>
+      </w:pPr>
+      <w:r>
+        <w:rPr>
+          <w:rFonts w:ascii="Consolas" w:cs="Consolas" w:eastAsia="Consolas" w:hAnsi="Consolas"/>
+          <w:color w:val="2E2E2E"/>
+          <w:sz w:val="18"/>
+          <w:szCs w:val="18"/>
+        </w:rPr>
+        <w:t xml:space="preserve">        # o (None, "no_pendiente"|"expirado"|"incorrecto") si no</w:t>
+      </w:r>
+    </w:p>
+    <w:p>
+      <w:pPr>
+        <w:spacing w:after="20" w:before="20"/>
+        <w:ind w:left="360"/>
+      </w:pPr>
+      <w:r>
+        <w:rPr>
+          <w:rFonts w:ascii="Consolas" w:cs="Consolas" w:eastAsia="Consolas" w:hAnsi="Consolas"/>
+          <w:color w:val="2E2E2E"/>
+          <w:sz w:val="18"/>
+          <w:szCs w:val="18"/>
+        </w:rPr>
+        <w:t xml:space="preserve">        ...</w:t>
+      </w:r>
+    </w:p>
+    <w:p>
+      <w:pPr>
+        <w:pStyle w:val="Heading2"/>
+      </w:pPr>
+      <w:r>
+        <w:t xml:space="preserve">15.2 Login en dos pasos</w:t>
+      </w:r>
+    </w:p>
+    <w:tbl>
+      <w:tblPr>
+        <w:tblW w:type="dxa" w:w="9360"/>
+        <w:tblBorders>
+          <w:top w:val="single" w:color="auto" w:sz="4"/>
+          <w:left w:val="single" w:color="auto" w:sz="4"/>
+          <w:bottom w:val="single" w:color="auto" w:sz="4"/>
+          <w:right w:val="single" w:color="auto" w:sz="4"/>
+          <w:insideH w:val="single" w:color="auto" w:sz="4"/>
+          <w:insideV w:val="single" w:color="auto" w:sz="4"/>
+        </w:tblBorders>
+      </w:tblPr>
+      <w:tblGrid>
+        <w:gridCol w:w="1600"/>
+        <w:gridCol w:w="3000"/>
+        <w:gridCol w:w="4760"/>
+      </w:tblGrid>
+      <w:tr>
+        <w:tc>
+          <w:tcPr>
+            <w:tcW w:type="dxa" w:w="1600"/>
+            <w:tcBorders>
+              <w:top w:val="single" w:color="1F4E79" w:sz="1"/>
+              <w:left w:val="single" w:color="1F4E79" w:sz="1"/>
+              <w:bottom w:val="single" w:color="1F4E79" w:sz="1"/>
+              <w:right w:val="single" w:color="1F4E79" w:sz="1"/>
+            </w:tcBorders>
+            <w:shd w:fill="1F4E79" w:val="clear"/>
+            <w:tcMar>
+              <w:top w:type="dxa" w:w="80"/>
+              <w:left w:type="dxa" w:w="120"/>
+              <w:bottom w:type="dxa" w:w="80"/>
+              <w:right w:type="dxa" w:w="120"/>
+            </w:tcMar>
+          </w:tcPr>
+          <w:p>
+            <w:r>
+              <w:rPr>
+                <w:rFonts w:ascii="Arial" w:cs="Arial" w:eastAsia="Arial" w:hAnsi="Arial"/>
+                <w:b/>
+                <w:bCs/>
+                <w:color w:val="FFFFFF"/>
+                <w:sz w:val="20"/>
+                <w:szCs w:val="20"/>
+              </w:rPr>
+              <w:t xml:space="preserve">Método</w:t>
+            </w:r>
+          </w:p>
+        </w:tc>
+        <w:tc>
+          <w:tcPr>
+            <w:tcW w:type="dxa" w:w="3000"/>
+            <w:tcBorders>
+              <w:top w:val="single" w:color="1F4E79" w:sz="1"/>
+              <w:left w:val="single" w:color="1F4E79" w:sz="1"/>
+              <w:bottom w:val="single" w:color="1F4E79" w:sz="1"/>
+              <w:right w:val="single" w:color="1F4E79" w:sz="1"/>
+            </w:tcBorders>
+            <w:shd w:fill="1F4E79" w:val="clear"/>
+            <w:tcMar>
+              <w:top w:type="dxa" w:w="80"/>
+              <w:left w:type="dxa" w:w="120"/>
+              <w:bottom w:type="dxa" w:w="80"/>
+              <w:right w:type="dxa" w:w="120"/>
+            </w:tcMar>
+          </w:tcPr>
+          <w:p>
+            <w:r>
+              <w:rPr>
+                <w:rFonts w:ascii="Arial" w:cs="Arial" w:eastAsia="Arial" w:hAnsi="Arial"/>
+                <w:b/>
+                <w:bCs/>
+                <w:color w:val="FFFFFF"/>
+                <w:sz w:val="20"/>
+                <w:szCs w:val="20"/>
+              </w:rPr>
+              <w:t xml:space="preserve">Ruta</w:t>
+            </w:r>
+          </w:p>
+        </w:tc>
+        <w:tc>
+          <w:tcPr>
+            <w:tcW w:type="dxa" w:w="4760"/>
+            <w:tcBorders>
+              <w:top w:val="single" w:color="1F4E79" w:sz="1"/>
+              <w:left w:val="single" w:color="1F4E79" w:sz="1"/>
+              <w:bottom w:val="single" w:color="1F4E79" w:sz="1"/>
+              <w:right w:val="single" w:color="1F4E79" w:sz="1"/>
+            </w:tcBorders>
+            <w:shd w:fill="1F4E79" w:val="clear"/>
+            <w:tcMar>
+              <w:top w:type="dxa" w:w="80"/>
+              <w:left w:type="dxa" w:w="120"/>
+              <w:bottom w:type="dxa" w:w="80"/>
+              <w:right w:type="dxa" w:w="120"/>
+            </w:tcMar>
+          </w:tcPr>
+          <w:p>
+            <w:r>
+              <w:rPr>
+                <w:rFonts w:ascii="Arial" w:cs="Arial" w:eastAsia="Arial" w:hAnsi="Arial"/>
+                <w:b/>
+                <w:bCs/>
+                <w:color w:val="FFFFFF"/>
+                <w:sz w:val="20"/>
+                <w:szCs w:val="20"/>
+              </w:rPr>
+              <w:t xml:space="preserve">Comportamiento</w:t>
+            </w:r>
+          </w:p>
+        </w:tc>
+      </w:tr>
+      <w:tr>
+        <w:tc>
+          <w:tcPr>
+            <w:tcW w:type="dxa" w:w="1600"/>
+            <w:tcBorders>
+              <w:top w:val="single" w:color="CCCCCC" w:sz="1"/>
+              <w:left w:val="single" w:color="CCCCCC" w:sz="1"/>
+              <w:bottom w:val="single" w:color="CCCCCC" w:sz="1"/>
+              <w:right w:val="single" w:color="CCCCCC" w:sz="1"/>
+            </w:tcBorders>
+            <w:tcMar>
+              <w:top w:type="dxa" w:w="80"/>
+              <w:left w:type="dxa" w:w="120"/>
+              <w:bottom w:type="dxa" w:w="80"/>
+              <w:right w:type="dxa" w:w="120"/>
+            </w:tcMar>
+          </w:tcPr>
+          <w:p>
+            <w:r>
+              <w:rPr>
+                <w:rFonts w:ascii="Arial" w:cs="Arial" w:eastAsia="Arial" w:hAnsi="Arial"/>
+                <w:sz w:val="20"/>
+                <w:szCs w:val="20"/>
+              </w:rPr>
+              <w:t xml:space="preserve">POST</w:t>
+            </w:r>
+          </w:p>
+        </w:tc>
+        <w:tc>
+          <w:tcPr>
+            <w:tcW w:type="dxa" w:w="3000"/>
+            <w:tcBorders>
+              <w:top w:val="single" w:color="CCCCCC" w:sz="1"/>
+              <w:left w:val="single" w:color="CCCCCC" w:sz="1"/>
+              <w:bottom w:val="single" w:color="CCCCCC" w:sz="1"/>
+              <w:right w:val="single" w:color="CCCCCC" w:sz="1"/>
+            </w:tcBorders>
+            <w:tcMar>
+              <w:top w:type="dxa" w:w="80"/>
+              <w:left w:type="dxa" w:w="120"/>
+              <w:bottom w:type="dxa" w:w="80"/>
+              <w:right w:type="dxa" w:w="120"/>
+            </w:tcMar>
+          </w:tcPr>
+          <w:p>
+            <w:r>
+              <w:rPr>
+                <w:rFonts w:ascii="Arial" w:cs="Arial" w:eastAsia="Arial" w:hAnsi="Arial"/>
+                <w:sz w:val="20"/>
+                <w:szCs w:val="20"/>
+              </w:rPr>
+              <w:t xml:space="preserve">/api/auth/login</w:t>
+            </w:r>
+          </w:p>
+        </w:tc>
+        <w:tc>
+          <w:tcPr>
+            <w:tcW w:type="dxa" w:w="4760"/>
+            <w:tcBorders>
+              <w:top w:val="single" w:color="CCCCCC" w:sz="1"/>
+              <w:left w:val="single" w:color="CCCCCC" w:sz="1"/>
+              <w:bottom w:val="single" w:color="CCCCCC" w:sz="1"/>
+              <w:right w:val="single" w:color="CCCCCC" w:sz="1"/>
+            </w:tcBorders>
+            <w:tcMar>
+              <w:top w:type="dxa" w:w="80"/>
+              <w:left w:type="dxa" w:w="120"/>
+              <w:bottom w:type="dxa" w:w="80"/>
+              <w:right w:type="dxa" w:w="120"/>
+            </w:tcMar>
+          </w:tcPr>
+          <w:p>
+            <w:r>
+              <w:rPr>
+                <w:rFonts w:ascii="Arial" w:cs="Arial" w:eastAsia="Arial" w:hAnsi="Arial"/>
+                <w:sz w:val="20"/>
+                <w:szCs w:val="20"/>
+              </w:rPr>
+              <w:t xml:space="preserve">Valida usuario/contrasena y envia un codigo de 6 digitos al correo (ya no entrega el token aqui)</w:t>
+            </w:r>
+          </w:p>
+        </w:tc>
+      </w:tr>
+      <w:tr>
+        <w:tc>
+          <w:tcPr>
+            <w:tcW w:type="dxa" w:w="1600"/>
+            <w:tcBorders>
+              <w:top w:val="single" w:color="CCCCCC" w:sz="1"/>
+              <w:left w:val="single" w:color="CCCCCC" w:sz="1"/>
+              <w:bottom w:val="single" w:color="CCCCCC" w:sz="1"/>
+              <w:right w:val="single" w:color="CCCCCC" w:sz="1"/>
+            </w:tcBorders>
+            <w:tcMar>
+              <w:top w:type="dxa" w:w="80"/>
+              <w:left w:type="dxa" w:w="120"/>
+              <w:bottom w:type="dxa" w:w="80"/>
+              <w:right w:type="dxa" w:w="120"/>
+            </w:tcMar>
+          </w:tcPr>
+          <w:p>
+            <w:r>
+              <w:rPr>
+                <w:rFonts w:ascii="Arial" w:cs="Arial" w:eastAsia="Arial" w:hAnsi="Arial"/>
+                <w:sz w:val="20"/>
+                <w:szCs w:val="20"/>
+              </w:rPr>
+              <w:t xml:space="preserve">POST</w:t>
+            </w:r>
+          </w:p>
+        </w:tc>
+        <w:tc>
+          <w:tcPr>
+            <w:tcW w:type="dxa" w:w="3000"/>
+            <w:tcBorders>
+              <w:top w:val="single" w:color="CCCCCC" w:sz="1"/>
+              <w:left w:val="single" w:color="CCCCCC" w:sz="1"/>
+              <w:bottom w:val="single" w:color="CCCCCC" w:sz="1"/>
+              <w:right w:val="single" w:color="CCCCCC" w:sz="1"/>
+            </w:tcBorders>
+            <w:tcMar>
+              <w:top w:type="dxa" w:w="80"/>
+              <w:left w:type="dxa" w:w="120"/>
+              <w:bottom w:type="dxa" w:w="80"/>
+              <w:right w:type="dxa" w:w="120"/>
+            </w:tcMar>
+          </w:tcPr>
+          <w:p>
+            <w:r>
+              <w:rPr>
+                <w:rFonts w:ascii="Arial" w:cs="Arial" w:eastAsia="Arial" w:hAnsi="Arial"/>
+                <w:sz w:val="20"/>
+                <w:szCs w:val="20"/>
+              </w:rPr>
+              <w:t xml:space="preserve">/api/auth/login/verify</w:t>
+            </w:r>
+          </w:p>
+        </w:tc>
+        <w:tc>
+          <w:tcPr>
+            <w:tcW w:type="dxa" w:w="4760"/>
+            <w:tcBorders>
+              <w:top w:val="single" w:color="CCCCCC" w:sz="1"/>
+              <w:left w:val="single" w:color="CCCCCC" w:sz="1"/>
+              <w:bottom w:val="single" w:color="CCCCCC" w:sz="1"/>
+              <w:right w:val="single" w:color="CCCCCC" w:sz="1"/>
+            </w:tcBorders>
+            <w:tcMar>
+              <w:top w:type="dxa" w:w="80"/>
+              <w:left w:type="dxa" w:w="120"/>
+              <w:bottom w:type="dxa" w:w="80"/>
+              <w:right w:type="dxa" w:w="120"/>
+            </w:tcMar>
+          </w:tcPr>
+          <w:p>
+            <w:r>
+              <w:rPr>
+                <w:rFonts w:ascii="Arial" w:cs="Arial" w:eastAsia="Arial" w:hAnsi="Arial"/>
+                <w:sz w:val="20"/>
+                <w:szCs w:val="20"/>
+              </w:rPr>
+              <w:t xml:space="preserve">Verifica el codigo; solo entonces entrega el token JWT (nuevo endpoint)</w:t>
+            </w:r>
+          </w:p>
+        </w:tc>
+      </w:tr>
+    </w:tbl>
+    <w:p>
+      <w:pPr>
+        <w:spacing w:after="120"/>
+      </w:pPr>
+    </w:p>
+    <w:p>
+      <w:pPr>
+        <w:spacing w:after="160"/>
+      </w:pPr>
+      <w:r>
+        <w:t xml:space="preserve">El registro sigue el mismo patrón: POST /api/auth/register envía el código, y POST /api/auth/verify lo valida, crea la cuenta y ahora además dispara un correo de bienvenida.</w:t>
+      </w:r>
+    </w:p>
+    <w:p>
+      <w:pPr>
+        <w:pStyle w:val="Heading2"/>
+      </w:pPr>
+      <w:r>
+        <w:t xml:space="preserve">15.3 Envío real de correo por Gmail</w:t>
+      </w:r>
+    </w:p>
+    <w:p>
+      <w:pPr>
+        <w:spacing w:after="160"/>
+      </w:pPr>
+      <w:r>
+        <w:t xml:space="preserve">Se agregó un tercer modo de envío junto a los que ya existían para Mailtrap:</w:t>
+      </w:r>
+    </w:p>
+    <w:tbl>
+      <w:tblPr>
+        <w:tblW w:type="dxa" w:w="9360"/>
+        <w:tblBorders>
+          <w:top w:val="single" w:color="auto" w:sz="4"/>
+          <w:left w:val="single" w:color="auto" w:sz="4"/>
+          <w:bottom w:val="single" w:color="auto" w:sz="4"/>
+          <w:right w:val="single" w:color="auto" w:sz="4"/>
+          <w:insideH w:val="single" w:color="auto" w:sz="4"/>
+          <w:insideV w:val="single" w:color="auto" w:sz="4"/>
+        </w:tblBorders>
+      </w:tblPr>
+      <w:tblGrid>
+        <w:gridCol w:w="3120"/>
+        <w:gridCol w:w="2500"/>
+        <w:gridCol w:w="3740"/>
+      </w:tblGrid>
+      <w:tr>
+        <w:tc>
+          <w:tcPr>
+            <w:tcW w:type="dxa" w:w="3120"/>
+            <w:tcBorders>
+              <w:top w:val="single" w:color="1F4E79" w:sz="1"/>
+              <w:left w:val="single" w:color="1F4E79" w:sz="1"/>
+              <w:bottom w:val="single" w:color="1F4E79" w:sz="1"/>
+              <w:right w:val="single" w:color="1F4E79" w:sz="1"/>
+            </w:tcBorders>
+            <w:shd w:fill="1F4E79" w:val="clear"/>
+            <w:tcMar>
+              <w:top w:type="dxa" w:w="80"/>
+              <w:left w:type="dxa" w:w="120"/>
+              <w:bottom w:type="dxa" w:w="80"/>
+              <w:right w:type="dxa" w:w="120"/>
+            </w:tcMar>
+          </w:tcPr>
+          <w:p>
+            <w:r>
+              <w:rPr>
+                <w:rFonts w:ascii="Arial" w:cs="Arial" w:eastAsia="Arial" w:hAnsi="Arial"/>
+                <w:b/>
+                <w:bCs/>
+                <w:color w:val="FFFFFF"/>
+                <w:sz w:val="20"/>
+                <w:szCs w:val="20"/>
+              </w:rPr>
+              <w:t xml:space="preserve">Modo (EMAIL_MODE)</w:t>
+            </w:r>
+          </w:p>
+        </w:tc>
+        <w:tc>
+          <w:tcPr>
+            <w:tcW w:type="dxa" w:w="2500"/>
+            <w:tcBorders>
+              <w:top w:val="single" w:color="1F4E79" w:sz="1"/>
+              <w:left w:val="single" w:color="1F4E79" w:sz="1"/>
+              <w:bottom w:val="single" w:color="1F4E79" w:sz="1"/>
+              <w:right w:val="single" w:color="1F4E79" w:sz="1"/>
+            </w:tcBorders>
+            <w:shd w:fill="1F4E79" w:val="clear"/>
+            <w:tcMar>
+              <w:top w:type="dxa" w:w="80"/>
+              <w:left w:type="dxa" w:w="120"/>
+              <w:bottom w:type="dxa" w:w="80"/>
+              <w:right w:type="dxa" w:w="120"/>
+            </w:tcMar>
+          </w:tcPr>
+          <w:p>
+            <w:r>
+              <w:rPr>
+                <w:rFonts w:ascii="Arial" w:cs="Arial" w:eastAsia="Arial" w:hAnsi="Arial"/>
+                <w:b/>
+                <w:bCs/>
+                <w:color w:val="FFFFFF"/>
+                <w:sz w:val="20"/>
+                <w:szCs w:val="20"/>
+              </w:rPr>
+              <w:t xml:space="preserve">Mecanismo</w:t>
+            </w:r>
+          </w:p>
+        </w:tc>
+        <w:tc>
+          <w:tcPr>
+            <w:tcW w:type="dxa" w:w="3740"/>
+            <w:tcBorders>
+              <w:top w:val="single" w:color="1F4E79" w:sz="1"/>
+              <w:left w:val="single" w:color="1F4E79" w:sz="1"/>
+              <w:bottom w:val="single" w:color="1F4E79" w:sz="1"/>
+              <w:right w:val="single" w:color="1F4E79" w:sz="1"/>
+            </w:tcBorders>
+            <w:shd w:fill="1F4E79" w:val="clear"/>
+            <w:tcMar>
+              <w:top w:type="dxa" w:w="80"/>
+              <w:left w:type="dxa" w:w="120"/>
+              <w:bottom w:type="dxa" w:w="80"/>
+              <w:right w:type="dxa" w:w="120"/>
+            </w:tcMar>
+          </w:tcPr>
+          <w:p>
+            <w:r>
+              <w:rPr>
+                <w:rFonts w:ascii="Arial" w:cs="Arial" w:eastAsia="Arial" w:hAnsi="Arial"/>
+                <w:b/>
+                <w:bCs/>
+                <w:color w:val="FFFFFF"/>
+                <w:sz w:val="20"/>
+                <w:szCs w:val="20"/>
+              </w:rPr>
+              <w:t xml:space="preserve">Uso</w:t>
+            </w:r>
+          </w:p>
+        </w:tc>
+      </w:tr>
+      <w:tr>
+        <w:tc>
+          <w:tcPr>
+            <w:tcW w:type="dxa" w:w="3120"/>
+            <w:tcBorders>
+              <w:top w:val="single" w:color="CCCCCC" w:sz="1"/>
+              <w:left w:val="single" w:color="CCCCCC" w:sz="1"/>
+              <w:bottom w:val="single" w:color="CCCCCC" w:sz="1"/>
+              <w:right w:val="single" w:color="CCCCCC" w:sz="1"/>
+            </w:tcBorders>
+            <w:tcMar>
+              <w:top w:type="dxa" w:w="80"/>
+              <w:left w:type="dxa" w:w="120"/>
+              <w:bottom w:type="dxa" w:w="80"/>
+              <w:right w:type="dxa" w:w="120"/>
+            </w:tcMar>
+          </w:tcPr>
+          <w:p>
+            <w:r>
+              <w:rPr>
+                <w:rFonts w:ascii="Arial" w:cs="Arial" w:eastAsia="Arial" w:hAnsi="Arial"/>
+                <w:sz w:val="20"/>
+                <w:szCs w:val="20"/>
+              </w:rPr>
+              <w:t xml:space="preserve">sdk</w:t>
+            </w:r>
+          </w:p>
+        </w:tc>
+        <w:tc>
+          <w:tcPr>
+            <w:tcW w:type="dxa" w:w="2500"/>
+            <w:tcBorders>
+              <w:top w:val="single" w:color="CCCCCC" w:sz="1"/>
+              <w:left w:val="single" w:color="CCCCCC" w:sz="1"/>
+              <w:bottom w:val="single" w:color="CCCCCC" w:sz="1"/>
+              <w:right w:val="single" w:color="CCCCCC" w:sz="1"/>
+            </w:tcBorders>
+            <w:tcMar>
+              <w:top w:type="dxa" w:w="80"/>
+              <w:left w:type="dxa" w:w="120"/>
+              <w:bottom w:type="dxa" w:w="80"/>
+              <w:right w:type="dxa" w:w="120"/>
+            </w:tcMar>
+          </w:tcPr>
+          <w:p>
+            <w:r>
+              <w:rPr>
+                <w:rFonts w:ascii="Arial" w:cs="Arial" w:eastAsia="Arial" w:hAnsi="Arial"/>
+                <w:sz w:val="20"/>
+                <w:szCs w:val="20"/>
+              </w:rPr>
+              <w:t xml:space="preserve">API de Mailtrap</w:t>
+            </w:r>
+          </w:p>
+        </w:tc>
+        <w:tc>
+          <w:tcPr>
+            <w:tcW w:type="dxa" w:w="3740"/>
+            <w:tcBorders>
+              <w:top w:val="single" w:color="CCCCCC" w:sz="1"/>
+              <w:left w:val="single" w:color="CCCCCC" w:sz="1"/>
+              <w:bottom w:val="single" w:color="CCCCCC" w:sz="1"/>
+              <w:right w:val="single" w:color="CCCCCC" w:sz="1"/>
+            </w:tcBorders>
+            <w:tcMar>
+              <w:top w:type="dxa" w:w="80"/>
+              <w:left w:type="dxa" w:w="120"/>
+              <w:bottom w:type="dxa" w:w="80"/>
+              <w:right w:type="dxa" w:w="120"/>
+            </w:tcMar>
+          </w:tcPr>
+          <w:p>
+            <w:r>
+              <w:rPr>
+                <w:rFonts w:ascii="Arial" w:cs="Arial" w:eastAsia="Arial" w:hAnsi="Arial"/>
+                <w:sz w:val="20"/>
+                <w:szCs w:val="20"/>
+              </w:rPr>
+              <w:t xml:space="preserve">Requiere dominio verificado</w:t>
+            </w:r>
+          </w:p>
+        </w:tc>
+      </w:tr>
+      <w:tr>
+        <w:tc>
+          <w:tcPr>
+            <w:tcW w:type="dxa" w:w="3120"/>
+            <w:tcBorders>
+              <w:top w:val="single" w:color="CCCCCC" w:sz="1"/>
+              <w:left w:val="single" w:color="CCCCCC" w:sz="1"/>
+              <w:bottom w:val="single" w:color="CCCCCC" w:sz="1"/>
+              <w:right w:val="single" w:color="CCCCCC" w:sz="1"/>
+            </w:tcBorders>
+            <w:tcMar>
+              <w:top w:type="dxa" w:w="80"/>
+              <w:left w:type="dxa" w:w="120"/>
+              <w:bottom w:type="dxa" w:w="80"/>
+              <w:right w:type="dxa" w:w="120"/>
+            </w:tcMar>
+          </w:tcPr>
+          <w:p>
+            <w:r>
+              <w:rPr>
+                <w:rFonts w:ascii="Arial" w:cs="Arial" w:eastAsia="Arial" w:hAnsi="Arial"/>
+                <w:sz w:val="20"/>
+                <w:szCs w:val="20"/>
+              </w:rPr>
+              <w:t xml:space="preserve">smtp</w:t>
+            </w:r>
+          </w:p>
+        </w:tc>
+        <w:tc>
+          <w:tcPr>
+            <w:tcW w:type="dxa" w:w="2500"/>
+            <w:tcBorders>
+              <w:top w:val="single" w:color="CCCCCC" w:sz="1"/>
+              <w:left w:val="single" w:color="CCCCCC" w:sz="1"/>
+              <w:bottom w:val="single" w:color="CCCCCC" w:sz="1"/>
+              <w:right w:val="single" w:color="CCCCCC" w:sz="1"/>
+            </w:tcBorders>
+            <w:tcMar>
+              <w:top w:type="dxa" w:w="80"/>
+              <w:left w:type="dxa" w:w="120"/>
+              <w:bottom w:type="dxa" w:w="80"/>
+              <w:right w:type="dxa" w:w="120"/>
+            </w:tcMar>
+          </w:tcPr>
+          <w:p>
+            <w:r>
+              <w:rPr>
+                <w:rFonts w:ascii="Arial" w:cs="Arial" w:eastAsia="Arial" w:hAnsi="Arial"/>
+                <w:sz w:val="20"/>
+                <w:szCs w:val="20"/>
+              </w:rPr>
+              <w:t xml:space="preserve">SMTP sandbox de Mailtrap</w:t>
+            </w:r>
+          </w:p>
+        </w:tc>
+        <w:tc>
+          <w:tcPr>
+            <w:tcW w:type="dxa" w:w="3740"/>
+            <w:tcBorders>
+              <w:top w:val="single" w:color="CCCCCC" w:sz="1"/>
+              <w:left w:val="single" w:color="CCCCCC" w:sz="1"/>
+              <w:bottom w:val="single" w:color="CCCCCC" w:sz="1"/>
+              <w:right w:val="single" w:color="CCCCCC" w:sz="1"/>
+            </w:tcBorders>
+            <w:tcMar>
+              <w:top w:type="dxa" w:w="80"/>
+              <w:left w:type="dxa" w:w="120"/>
+              <w:bottom w:type="dxa" w:w="80"/>
+              <w:right w:type="dxa" w:w="120"/>
+            </w:tcMar>
+          </w:tcPr>
+          <w:p>
+            <w:r>
+              <w:rPr>
+                <w:rFonts w:ascii="Arial" w:cs="Arial" w:eastAsia="Arial" w:hAnsi="Arial"/>
+                <w:sz w:val="20"/>
+                <w:szCs w:val="20"/>
+              </w:rPr>
+              <w:t xml:space="preserve">Solo pruebas, no llega a bandejas reales</w:t>
+            </w:r>
+          </w:p>
+        </w:tc>
+      </w:tr>
+      <w:tr>
+        <w:tc>
+          <w:tcPr>
+            <w:tcW w:type="dxa" w:w="3120"/>
+            <w:tcBorders>
+              <w:top w:val="single" w:color="CCCCCC" w:sz="1"/>
+              <w:left w:val="single" w:color="CCCCCC" w:sz="1"/>
+              <w:bottom w:val="single" w:color="CCCCCC" w:sz="1"/>
+              <w:right w:val="single" w:color="CCCCCC" w:sz="1"/>
+            </w:tcBorders>
+            <w:tcMar>
+              <w:top w:type="dxa" w:w="80"/>
+              <w:left w:type="dxa" w:w="120"/>
+              <w:bottom w:type="dxa" w:w="80"/>
+              <w:right w:type="dxa" w:w="120"/>
+            </w:tcMar>
+          </w:tcPr>
+          <w:p>
+            <w:r>
+              <w:rPr>
+                <w:rFonts w:ascii="Arial" w:cs="Arial" w:eastAsia="Arial" w:hAnsi="Arial"/>
+                <w:sz w:val="20"/>
+                <w:szCs w:val="20"/>
+              </w:rPr>
+              <w:t xml:space="preserve">gmail</w:t>
+            </w:r>
+          </w:p>
+        </w:tc>
+        <w:tc>
+          <w:tcPr>
+            <w:tcW w:type="dxa" w:w="2500"/>
+            <w:tcBorders>
+              <w:top w:val="single" w:color="CCCCCC" w:sz="1"/>
+              <w:left w:val="single" w:color="CCCCCC" w:sz="1"/>
+              <w:bottom w:val="single" w:color="CCCCCC" w:sz="1"/>
+              <w:right w:val="single" w:color="CCCCCC" w:sz="1"/>
+            </w:tcBorders>
+            <w:tcMar>
+              <w:top w:type="dxa" w:w="80"/>
+              <w:left w:type="dxa" w:w="120"/>
+              <w:bottom w:type="dxa" w:w="80"/>
+              <w:right w:type="dxa" w:w="120"/>
+            </w:tcMar>
+          </w:tcPr>
+          <w:p>
+            <w:r>
+              <w:rPr>
+                <w:rFonts w:ascii="Arial" w:cs="Arial" w:eastAsia="Arial" w:hAnsi="Arial"/>
+                <w:sz w:val="20"/>
+                <w:szCs w:val="20"/>
+              </w:rPr>
+              <w:t xml:space="preserve">SMTP real de Gmail</w:t>
+            </w:r>
+          </w:p>
+        </w:tc>
+        <w:tc>
+          <w:tcPr>
+            <w:tcW w:type="dxa" w:w="3740"/>
+            <w:tcBorders>
+              <w:top w:val="single" w:color="CCCCCC" w:sz="1"/>
+              <w:left w:val="single" w:color="CCCCCC" w:sz="1"/>
+              <w:bottom w:val="single" w:color="CCCCCC" w:sz="1"/>
+              <w:right w:val="single" w:color="CCCCCC" w:sz="1"/>
+            </w:tcBorders>
+            <w:tcMar>
+              <w:top w:type="dxa" w:w="80"/>
+              <w:left w:type="dxa" w:w="120"/>
+              <w:bottom w:type="dxa" w:w="80"/>
+              <w:right w:type="dxa" w:w="120"/>
+            </w:tcMar>
+          </w:tcPr>
+          <w:p>
+            <w:r>
+              <w:rPr>
+                <w:rFonts w:ascii="Arial" w:cs="Arial" w:eastAsia="Arial" w:hAnsi="Arial"/>
+                <w:sz w:val="20"/>
+                <w:szCs w:val="20"/>
+              </w:rPr>
+              <w:t xml:space="preserve">El correo llega de verdad al destinatario</w:t>
+            </w:r>
+          </w:p>
+        </w:tc>
+      </w:tr>
+    </w:tbl>
+    <w:p>
+      <w:pPr>
+        <w:spacing w:after="120"/>
+      </w:pPr>
+    </w:p>
+    <w:p>
+      <w:pPr>
+        <w:spacing w:after="160"/>
+      </w:pPr>
+      <w:r>
+        <w:t xml:space="preserve">Configuración en .env para el modo gmail:</w:t>
+      </w:r>
+    </w:p>
+    <w:p>
+      <w:pPr>
+        <w:spacing w:after="20" w:before="20"/>
+        <w:ind w:left="360"/>
+      </w:pPr>
+      <w:r>
+        <w:rPr>
+          <w:rFonts w:ascii="Consolas" w:cs="Consolas" w:eastAsia="Consolas" w:hAnsi="Consolas"/>
+          <w:color w:val="2E2E2E"/>
+          <w:sz w:val="18"/>
+          <w:szCs w:val="18"/>
+        </w:rPr>
+        <w:t xml:space="preserve">EMAIL_MODE=gmail</w:t>
+      </w:r>
+    </w:p>
+    <w:p>
+      <w:pPr>
+        <w:spacing w:after="20" w:before="20"/>
+        <w:ind w:left="360"/>
+      </w:pPr>
+      <w:r>
+        <w:rPr>
+          <w:rFonts w:ascii="Consolas" w:cs="Consolas" w:eastAsia="Consolas" w:hAnsi="Consolas"/>
+          <w:color w:val="2E2E2E"/>
+          <w:sz w:val="18"/>
+          <w:szCs w:val="18"/>
+        </w:rPr>
+        <w:t xml:space="preserve">GMAIL_USER=tucorreo@gmail.com</w:t>
+      </w:r>
+    </w:p>
+    <w:p>
+      <w:pPr>
+        <w:spacing w:after="20" w:before="20"/>
+        <w:ind w:left="360"/>
+      </w:pPr>
+      <w:r>
+        <w:rPr>
+          <w:rFonts w:ascii="Consolas" w:cs="Consolas" w:eastAsia="Consolas" w:hAnsi="Consolas"/>
+          <w:color w:val="2E2E2E"/>
+          <w:sz w:val="18"/>
+          <w:szCs w:val="18"/>
+        </w:rPr>
+        <w:t xml:space="preserve">GMAIL_APP_PASSWORD=xxxx xxxx xxxx xxxx   # contrasena de aplicacion, no la normal</w:t>
+      </w:r>
+    </w:p>
+    <w:p>
+      <w:pPr>
+        <w:spacing w:after="120"/>
+      </w:pPr>
+    </w:p>
+    <w:p>
+      <w:pPr>
+        <w:spacing w:after="160"/>
+      </w:pPr>
+      <w:r>
+        <w:t xml:space="preserve">Evidencia: durante la verificación de esta actualización se recibieron correctamente los tres correos reales en la bandeja de entrada:</w:t>
+      </w:r>
+    </w:p>
+    <w:p>
+      <w:pPr>
+        <w:spacing w:after="20" w:before="20"/>
+        <w:ind w:left="360"/>
+        <w:shd w:val="clear" w:fill="ECFDF5"/>
+      </w:pPr>
+      <w:r>
+        <w:rPr>
+          <w:rFonts w:ascii="Consolas" w:cs="Consolas" w:eastAsia="Consolas" w:hAnsi="Consolas"/>
+          <w:color w:val="065F46"/>
+          <w:sz w:val="18"/>
+          <w:szCs w:val="18"/>
+        </w:rPr>
+        <w:t xml:space="preserve">PetConnect - Codigo de verificacion       (registro)</w:t>
+      </w:r>
+    </w:p>
+    <w:p>
+      <w:pPr>
+        <w:spacing w:after="20" w:before="20"/>
+        <w:ind w:left="360"/>
+        <w:shd w:val="clear" w:fill="ECFDF5"/>
+      </w:pPr>
+      <w:r>
+        <w:rPr>
+          <w:rFonts w:ascii="Consolas" w:cs="Consolas" w:eastAsia="Consolas" w:hAnsi="Consolas"/>
+          <w:color w:val="065F46"/>
+          <w:sz w:val="18"/>
+          <w:szCs w:val="18"/>
+        </w:rPr>
+        <w:t xml:space="preserve">PetConnect - Codigo de inicio de sesion   (login)</w:t>
+      </w:r>
+    </w:p>
+    <w:p>
+      <w:pPr>
+        <w:spacing w:after="20" w:before="20"/>
+        <w:ind w:left="360"/>
+        <w:shd w:val="clear" w:fill="ECFDF5"/>
+      </w:pPr>
+      <w:r>
+        <w:rPr>
+          <w:rFonts w:ascii="Consolas" w:cs="Consolas" w:eastAsia="Consolas" w:hAnsi="Consolas"/>
+          <w:color w:val="065F46"/>
+          <w:sz w:val="18"/>
+          <w:szCs w:val="18"/>
+        </w:rPr>
+        <w:t xml:space="preserve">Bienvenido a la familia PetConnect        (al completar el registro)</w:t>
+      </w:r>
+    </w:p>
+    <w:p>
+      <w:pPr>
+        <w:pStyle w:val="Heading2"/>
+      </w:pPr>
+      <w:r>
+        <w:t xml:space="preserve">15.4 Diseño de las plantillas de correo</w:t>
+      </w:r>
+    </w:p>
+    <w:p>
+      <w:pPr>
+        <w:spacing w:after="160"/>
+      </w:pPr>
+      <w:r>
+        <w:t xml:space="preserve">Las plantillas (correo/plantillas.py) se diseñaron con tablas HTML (compatibles con Outlook y Gmail) reflejando la identidad visual real de la aplicación web: la barra superior usa los cuatro colores del logo de PetConnect, el resto del correo usa tipografía negra sobre blanco igual que los botones del sitio, y el código de verificación se muestra en una caja negra grande. El correo de bienvenida agrega el eslogan del sitio ("Todo para tu mascota en un solo lugar") y un botón de acceso directo a la aplicación.</w:t>
+      </w:r>
+    </w:p>
+    <w:p>
+      <w:pPr>
+        <w:pStyle w:val="Heading2"/>
+      </w:pPr>
+      <w:r>
+        <w:t xml:space="preserve">15.5 Validación de dominio de correo</w:t>
+      </w:r>
+    </w:p>
+    <w:p>
+      <w:pPr>
+        <w:spacing w:after="160"/>
+      </w:pPr>
+      <w:r>
+        <w:t xml:space="preserve">Nuevo endpoint POST /api/utils/validar-correo: valida el formato del correo y, además, consulta los registros MX del dominio para confirmar que puede recibir correo (detecta dominios inventados o con errores de tipeo). Esta misma validación se aplica también dentro de POST /api/auth/register antes de crear la cuenta, y en el frontend web (RegisterModal.jsx) se muestra en vivo mientras el usuario escribe su correo.</w:t>
+      </w:r>
+    </w:p>
+    <w:p>
+      <w:pPr>
+        <w:pStyle w:val="Heading2"/>
+      </w:pPr>
+      <w:r>
+        <w:t xml:space="preserve">15.6 Seguridad adicional</w:t>
+      </w:r>
+    </w:p>
+    <w:tbl>
+      <w:tblPr>
+        <w:tblW w:type="dxa" w:w="9600"/>
+        <w:tblBorders>
+          <w:top w:val="single" w:color="auto" w:sz="4"/>
+          <w:left w:val="single" w:color="auto" w:sz="4"/>
+          <w:bottom w:val="single" w:color="auto" w:sz="4"/>
+          <w:right w:val="single" w:color="auto" w:sz="4"/>
+          <w:insideH w:val="single" w:color="auto" w:sz="4"/>
+          <w:insideV w:val="single" w:color="auto" w:sz="4"/>
+        </w:tblBorders>
+      </w:tblPr>
+      <w:tblGrid>
+        <w:gridCol w:w="3200"/>
+        <w:gridCol w:w="3000"/>
+        <w:gridCol w:w="3400"/>
+      </w:tblGrid>
+      <w:tr>
+        <w:tc>
+          <w:tcPr>
+            <w:tcW w:type="dxa" w:w="3200"/>
+            <w:tcBorders>
+              <w:top w:val="single" w:color="1F4E79" w:sz="1"/>
+              <w:left w:val="single" w:color="1F4E79" w:sz="1"/>
+              <w:bottom w:val="single" w:color="1F4E79" w:sz="1"/>
+              <w:right w:val="single" w:color="1F4E79" w:sz="1"/>
+            </w:tcBorders>
+            <w:shd w:fill="1F4E79" w:val="clear"/>
+            <w:tcMar>
+              <w:top w:type="dxa" w:w="80"/>
+              <w:left w:type="dxa" w:w="120"/>
+              <w:bottom w:type="dxa" w:w="80"/>
+              <w:right w:type="dxa" w:w="120"/>
+            </w:tcMar>
+          </w:tcPr>
+          <w:p>
+            <w:r>
+              <w:rPr>
+                <w:rFonts w:ascii="Arial" w:cs="Arial" w:eastAsia="Arial" w:hAnsi="Arial"/>
+                <w:b/>
+                <w:bCs/>
+                <w:color w:val="FFFFFF"/>
+                <w:sz w:val="20"/>
+                <w:szCs w:val="20"/>
+              </w:rPr>
+              <w:t xml:space="preserve">Cambio</w:t>
+            </w:r>
+          </w:p>
+        </w:tc>
+        <w:tc>
+          <w:tcPr>
+            <w:tcW w:type="dxa" w:w="3000"/>
+            <w:tcBorders>
+              <w:top w:val="single" w:color="1F4E79" w:sz="1"/>
+              <w:left w:val="single" w:color="1F4E79" w:sz="1"/>
+              <w:bottom w:val="single" w:color="1F4E79" w:sz="1"/>
+              <w:right w:val="single" w:color="1F4E79" w:sz="1"/>
+            </w:tcBorders>
+            <w:shd w:fill="1F4E79" w:val="clear"/>
+            <w:tcMar>
+              <w:top w:type="dxa" w:w="80"/>
+              <w:left w:type="dxa" w:w="120"/>
+              <w:bottom w:type="dxa" w:w="80"/>
+              <w:right w:type="dxa" w:w="120"/>
+            </w:tcMar>
+          </w:tcPr>
+          <w:p>
+            <w:r>
+              <w:rPr>
+                <w:rFonts w:ascii="Arial" w:cs="Arial" w:eastAsia="Arial" w:hAnsi="Arial"/>
+                <w:b/>
+                <w:bCs/>
+                <w:color w:val="FFFFFF"/>
+                <w:sz w:val="20"/>
+                <w:szCs w:val="20"/>
+              </w:rPr>
+              <w:t xml:space="preserve">Antes</w:t>
+            </w:r>
+          </w:p>
+        </w:tc>
+        <w:tc>
+          <w:tcPr>
+            <w:tcW w:type="dxa" w:w="3400"/>
+            <w:tcBorders>
+              <w:top w:val="single" w:color="1F4E79" w:sz="1"/>
+              <w:left w:val="single" w:color="1F4E79" w:sz="1"/>
+              <w:bottom w:val="single" w:color="1F4E79" w:sz="1"/>
+              <w:right w:val="single" w:color="1F4E79" w:sz="1"/>
+            </w:tcBorders>
+            <w:shd w:fill="1F4E79" w:val="clear"/>
+            <w:tcMar>
+              <w:top w:type="dxa" w:w="80"/>
+              <w:left w:type="dxa" w:w="120"/>
+              <w:bottom w:type="dxa" w:w="80"/>
+              <w:right w:type="dxa" w:w="120"/>
+            </w:tcMar>
+          </w:tcPr>
+          <w:p>
+            <w:r>
+              <w:rPr>
+                <w:rFonts w:ascii="Arial" w:cs="Arial" w:eastAsia="Arial" w:hAnsi="Arial"/>
+                <w:b/>
+                <w:bCs/>
+                <w:color w:val="FFFFFF"/>
+                <w:sz w:val="20"/>
+                <w:szCs w:val="20"/>
+              </w:rPr>
+              <w:t xml:space="preserve">Ahora</w:t>
+            </w:r>
+          </w:p>
+        </w:tc>
+      </w:tr>
+      <w:tr>
+        <w:tc>
+          <w:tcPr>
+            <w:tcW w:type="dxa" w:w="3200"/>
+            <w:tcBorders>
+              <w:top w:val="single" w:color="CCCCCC" w:sz="1"/>
+              <w:left w:val="single" w:color="CCCCCC" w:sz="1"/>
+              <w:bottom w:val="single" w:color="CCCCCC" w:sz="1"/>
+              <w:right w:val="single" w:color="CCCCCC" w:sz="1"/>
+            </w:tcBorders>
+            <w:tcMar>
+              <w:top w:type="dxa" w:w="80"/>
+              <w:left w:type="dxa" w:w="120"/>
+              <w:bottom w:type="dxa" w:w="80"/>
+              <w:right w:type="dxa" w:w="120"/>
+            </w:tcMar>
+          </w:tcPr>
+          <w:p>
+            <w:r>
+              <w:rPr>
+                <w:rFonts w:ascii="Arial" w:cs="Arial" w:eastAsia="Arial" w:hAnsi="Arial"/>
+                <w:sz w:val="20"/>
+                <w:szCs w:val="20"/>
+              </w:rPr>
+              <w:t xml:space="preserve">Generación del código OTP</w:t>
+            </w:r>
+          </w:p>
+        </w:tc>
+        <w:tc>
+          <w:tcPr>
+            <w:tcW w:type="dxa" w:w="3000"/>
+            <w:tcBorders>
+              <w:top w:val="single" w:color="CCCCCC" w:sz="1"/>
+              <w:left w:val="single" w:color="CCCCCC" w:sz="1"/>
+              <w:bottom w:val="single" w:color="CCCCCC" w:sz="1"/>
+              <w:right w:val="single" w:color="CCCCCC" w:sz="1"/>
+            </w:tcBorders>
+            <w:tcMar>
+              <w:top w:type="dxa" w:w="80"/>
+              <w:left w:type="dxa" w:w="120"/>
+              <w:bottom w:type="dxa" w:w="80"/>
+              <w:right w:type="dxa" w:w="120"/>
+            </w:tcMar>
+          </w:tcPr>
+          <w:p>
+            <w:r>
+              <w:rPr>
+                <w:rFonts w:ascii="Arial" w:cs="Arial" w:eastAsia="Arial" w:hAnsi="Arial"/>
+                <w:sz w:val="20"/>
+                <w:szCs w:val="20"/>
+              </w:rPr>
+              <w:t xml:space="preserve">random.randint</w:t>
+            </w:r>
+          </w:p>
+        </w:tc>
+        <w:tc>
+          <w:tcPr>
+            <w:tcW w:type="dxa" w:w="3400"/>
+            <w:tcBorders>
+              <w:top w:val="single" w:color="CCCCCC" w:sz="1"/>
+              <w:left w:val="single" w:color="CCCCCC" w:sz="1"/>
+              <w:bottom w:val="single" w:color="CCCCCC" w:sz="1"/>
+              <w:right w:val="single" w:color="CCCCCC" w:sz="1"/>
+            </w:tcBorders>
+            <w:tcMar>
+              <w:top w:type="dxa" w:w="80"/>
+              <w:left w:type="dxa" w:w="120"/>
+              <w:bottom w:type="dxa" w:w="80"/>
+              <w:right w:type="dxa" w:w="120"/>
+            </w:tcMar>
+          </w:tcPr>
+          <w:p>
+            <w:r>
+              <w:rPr>
+                <w:rFonts w:ascii="Arial" w:cs="Arial" w:eastAsia="Arial" w:hAnsi="Arial"/>
+                <w:sz w:val="20"/>
+                <w:szCs w:val="20"/>
+              </w:rPr>
+              <w:t xml:space="preserve">secrets.randbelow (criptográficamente seguro)</w:t>
+            </w:r>
+          </w:p>
+        </w:tc>
+      </w:tr>
+      <w:tr>
+        <w:tc>
+          <w:tcPr>
+            <w:tcW w:type="dxa" w:w="3200"/>
+            <w:tcBorders>
+              <w:top w:val="single" w:color="CCCCCC" w:sz="1"/>
+              <w:left w:val="single" w:color="CCCCCC" w:sz="1"/>
+              <w:bottom w:val="single" w:color="CCCCCC" w:sz="1"/>
+              <w:right w:val="single" w:color="CCCCCC" w:sz="1"/>
+            </w:tcBorders>
+            <w:tcMar>
+              <w:top w:type="dxa" w:w="80"/>
+              <w:left w:type="dxa" w:w="120"/>
+              <w:bottom w:type="dxa" w:w="80"/>
+              <w:right w:type="dxa" w:w="120"/>
+            </w:tcMar>
+          </w:tcPr>
+          <w:p>
+            <w:r>
+              <w:rPr>
+                <w:rFonts w:ascii="Arial" w:cs="Arial" w:eastAsia="Arial" w:hAnsi="Arial"/>
+                <w:sz w:val="20"/>
+                <w:szCs w:val="20"/>
+              </w:rPr>
+              <w:t xml:space="preserve">Duración del token JWT</w:t>
+            </w:r>
+          </w:p>
+        </w:tc>
+        <w:tc>
+          <w:tcPr>
+            <w:tcW w:type="dxa" w:w="3000"/>
+            <w:tcBorders>
+              <w:top w:val="single" w:color="CCCCCC" w:sz="1"/>
+              <w:left w:val="single" w:color="CCCCCC" w:sz="1"/>
+              <w:bottom w:val="single" w:color="CCCCCC" w:sz="1"/>
+              <w:right w:val="single" w:color="CCCCCC" w:sz="1"/>
+            </w:tcBorders>
+            <w:tcMar>
+              <w:top w:type="dxa" w:w="80"/>
+              <w:left w:type="dxa" w:w="120"/>
+              <w:bottom w:type="dxa" w:w="80"/>
+              <w:right w:type="dxa" w:w="120"/>
+            </w:tcMar>
+          </w:tcPr>
+          <w:p>
+            <w:r>
+              <w:rPr>
+                <w:rFonts w:ascii="Arial" w:cs="Arial" w:eastAsia="Arial" w:hAnsi="Arial"/>
+                <w:sz w:val="20"/>
+                <w:szCs w:val="20"/>
+              </w:rPr>
+              <w:t xml:space="preserve">7 días</w:t>
+            </w:r>
+          </w:p>
+        </w:tc>
+        <w:tc>
+          <w:tcPr>
+            <w:tcW w:type="dxa" w:w="3400"/>
+            <w:tcBorders>
+              <w:top w:val="single" w:color="CCCCCC" w:sz="1"/>
+              <w:left w:val="single" w:color="CCCCCC" w:sz="1"/>
+              <w:bottom w:val="single" w:color="CCCCCC" w:sz="1"/>
+              <w:right w:val="single" w:color="CCCCCC" w:sz="1"/>
+            </w:tcBorders>
+            <w:tcMar>
+              <w:top w:type="dxa" w:w="80"/>
+              <w:left w:type="dxa" w:w="120"/>
+              <w:bottom w:type="dxa" w:w="80"/>
+              <w:right w:type="dxa" w:w="120"/>
+            </w:tcMar>
+          </w:tcPr>
+          <w:p>
+            <w:r>
+              <w:rPr>
+                <w:rFonts w:ascii="Arial" w:cs="Arial" w:eastAsia="Arial" w:hAnsi="Arial"/>
+                <w:sz w:val="20"/>
+                <w:szCs w:val="20"/>
+              </w:rPr>
+              <w:t xml:space="preserve">24 horas</w:t>
+            </w:r>
+          </w:p>
+        </w:tc>
+      </w:tr>
+    </w:tbl>
     <w:sectPr>
       <w:headerReference w:type="default" r:id="rId7"/>
       <w:footerReference w:type="default" r:id="rId8"/>

</xml_diff>